<commit_message>
Mark the two production membranes in Table 2
controls() carried a dict of labels for the two membranes the study actually reports, but
every row label came from lab(), so the dict was never read and the table listed all 24
kinetic variants with nothing distinguishing Phase 1 and Phase 2 from the sensitivity
variants around them. lab() now uses it, so those two rows read "HH, 6.3 C (Phase 1)" and
"NavC, tau_m8 = 1.5 ms (Phase 2)". Documents rebuilt; tests: 15 passed.

Co-Authored-By: Claude Opus 5 <noreply@anthropic.com>
Claude-Session: https://claude.ai/code/session_01T9qr3FZNJ9jk8MqYJ2fVxn
</commit_message>
<xml_diff>
--- a/manuscript/ephaptic_crosstalk_manuscript.docx
+++ b/manuscript/ephaptic_crosstalk_manuscript.docx
@@ -6599,7 +6599,7 @@
               <w:jc w:val="left"/>
             </w:pPr>
             <w:r>
-              <w:t xml:space="preserve">HH, 6.3 °C (φ = 1)</w:t>
+              <w:t xml:space="preserve">HH, 6.3 °C (Phase 1)</w:t>
             </w:r>
           </w:p>
         </w:tc>
@@ -7901,7 +7901,7 @@
               <w:t xml:space="preserve"> </w:t>
             </w:r>
             <w:r>
-              <w:t xml:space="preserve">= 1.5 ms</w:t>
+              <w:t xml:space="preserve">= 1.5 ms (Phase 2)</w:t>
             </w:r>
           </w:p>
         </w:tc>

</xml_diff>